<commit_message>
Plantillas factura .docx v2: 1 página + email danielorozco@twimproject.com + fondo crema cálido
3 cambios pedidos por Daniel tras revisar la v1:

1. Cabe en UNA hoja A4 · compactado · título 21→18pt, padding header
   240→150 dxa, margen body 520→320, fuentes y espaciados reducidos,
   dirección del emisor de 4 líneas a 2.
2. Email · equipo@theworldismindproject.com → danielorozco@twimproject.com
   (el email clínico/pacientes, correcto para facturas). Cambiado en el
   bloque emisor y en el footer de ambas plantillas.
3. Fondo · blanco → crema cálido #F5EFE3 en toda la página (w:background
   + shading de celda body). Tarjetas parties y filas de datos en crema
   claro #FDFCFA para contraste. Header verde y total box intactos.

Logo mantenido (Daniel · «el logo me encanta»).

Regenerado vía generar-facturas-docx.py actualizado.
</commit_message>
<xml_diff>
--- a/documentos-internos/plantillas/factura-anual-renta.docx
+++ b/documentos-internos/plantillas/factura-anual-renta.docx
@@ -1,6 +1,7 @@
 
 <file path=word/document.xml><?xml version="1.0" encoding="utf-8"?>
 <w:document xmlns:wpc="http://schemas.microsoft.com/office/word/2010/wordprocessingCanvas" xmlns:mo="http://schemas.microsoft.com/office/mac/office/2008/main" xmlns:mc="http://schemas.openxmlformats.org/markup-compatibility/2006" xmlns:mv="urn:schemas-microsoft-com:mac:vml" xmlns:o="urn:schemas-microsoft-com:office:office" xmlns:r="http://schemas.openxmlformats.org/officeDocument/2006/relationships" xmlns:m="http://schemas.openxmlformats.org/officeDocument/2006/math" xmlns:v="urn:schemas-microsoft-com:vml" xmlns:wp14="http://schemas.microsoft.com/office/word/2010/wordprocessingDrawing" xmlns:wp="http://schemas.openxmlformats.org/drawingml/2006/wordprocessingDrawing" xmlns:w10="urn:schemas-microsoft-com:office:word" xmlns:w="http://schemas.openxmlformats.org/wordprocessingml/2006/main" xmlns:w14="http://schemas.microsoft.com/office/word/2010/wordml" xmlns:wpg="http://schemas.microsoft.com/office/word/2010/wordprocessingGroup" xmlns:wpi="http://schemas.microsoft.com/office/word/2010/wordprocessingInk" xmlns:wne="http://schemas.microsoft.com/office/word/2006/wordml" xmlns:wps="http://schemas.microsoft.com/office/word/2010/wordprocessingShape" mc:Ignorable="w14 wp14">
+  <w:background w:color="F5EFE3"/>
   <w:body>
     <w:tbl>
       <w:tblPr>
@@ -25,10 +26,10 @@
               <w:right w:val="nil"/>
             </w:tcBorders>
             <w:tcMar>
-              <w:top w:w="240" w:type="dxa"/>
-              <w:bottom w:w="240" w:type="dxa"/>
-              <w:left w:w="340" w:type="dxa"/>
-              <w:right w:w="340" w:type="dxa"/>
+              <w:top w:w="150" w:type="dxa"/>
+              <w:bottom w:w="150" w:type="dxa"/>
+              <w:left w:w="320" w:type="dxa"/>
+              <w:right w:w="320" w:type="dxa"/>
             </w:tcMar>
             <w:vAlign w:val="center"/>
           </w:tcPr>
@@ -36,7 +37,7 @@
             <w:r>
               <w:drawing>
                 <wp:inline xmlns:a="http://schemas.openxmlformats.org/drawingml/2006/main" xmlns:pic="http://schemas.openxmlformats.org/drawingml/2006/picture">
-                  <wp:extent cx="720000" cy="432966"/>
+                  <wp:extent cx="612000" cy="368021"/>
                   <wp:docPr id="1" name="Picture 1"/>
                   <wp:cNvGraphicFramePr>
                     <a:graphicFrameLocks noChangeAspect="1"/>
@@ -57,7 +58,7 @@
                         <pic:spPr>
                           <a:xfrm>
                             <a:off x="0" y="0"/>
-                            <a:ext cx="720000" cy="432966"/>
+                            <a:ext cx="612000" cy="368021"/>
                           </a:xfrm>
                           <a:prstGeom prst="rect"/>
                         </pic:spPr>
@@ -70,7 +71,7 @@
           </w:p>
           <w:p>
             <w:pPr>
-              <w:spacing w:before="0" w:after="0" w:line="300" w:lineRule="auto"/>
+              <w:spacing w:before="0" w:after="0" w:line="276" w:lineRule="auto"/>
             </w:pPr>
             <w:r>
               <w:rPr>
@@ -78,7 +79,7 @@
                 <w:b/>
                 <w:i w:val="0"/>
                 <w:color w:val="C2A78B"/>
-                <w:sz w:val="18"/>
+                <w:sz w:val="17"/>
                 <w:spacing w:val="30"/>
               </w:rPr>
               <w:t>TWIM PROJECT</w:t>
@@ -86,7 +87,7 @@
           </w:p>
           <w:p>
             <w:pPr>
-              <w:spacing w:before="0" w:after="0" w:line="300" w:lineRule="auto"/>
+              <w:spacing w:before="0" w:after="0" w:line="276" w:lineRule="auto"/>
             </w:pPr>
             <w:r>
               <w:rPr>
@@ -94,7 +95,7 @@
                 <w:b w:val="0"/>
                 <w:i w:val="0"/>
                 <w:color w:val="FDFCFA"/>
-                <w:sz w:val="20"/>
+                <w:sz w:val="19"/>
               </w:rPr>
               <w:t>Daniel Orozco Abia · CV11515</w:t>
             </w:r>
@@ -111,15 +112,16 @@
               <w:right w:val="nil"/>
             </w:tcBorders>
             <w:tcMar>
-              <w:top w:w="240" w:type="dxa"/>
-              <w:bottom w:w="240" w:type="dxa"/>
-              <w:left w:w="340" w:type="dxa"/>
-              <w:right w:w="340" w:type="dxa"/>
+              <w:top w:w="150" w:type="dxa"/>
+              <w:bottom w:w="150" w:type="dxa"/>
+              <w:left w:w="320" w:type="dxa"/>
+              <w:right w:w="320" w:type="dxa"/>
             </w:tcMar>
             <w:vAlign w:val="center"/>
           </w:tcPr>
           <w:p>
             <w:pPr>
+              <w:spacing w:after="40"/>
               <w:jc w:val="right"/>
             </w:pPr>
             <w:r>
@@ -128,8 +130,8 @@
                 <w:b/>
                 <w:i w:val="0"/>
                 <w:color w:val="C2A78B"/>
-                <w:sz w:val="17"/>
-                <w:spacing w:val="14"/>
+                <w:sz w:val="16"/>
+                <w:spacing w:val="12"/>
               </w:rPr>
               <w:t xml:space="preserve">Nº FACTURA  </w:t>
             </w:r>
@@ -139,14 +141,14 @@
                 <w:b w:val="0"/>
                 <w:i w:val="0"/>
                 <w:color w:val="FDFCFA"/>
-                <w:sz w:val="21"/>
+                <w:sz w:val="20"/>
               </w:rPr>
               <w:t>{{NUMERO_FACTURA}}</w:t>
             </w:r>
           </w:p>
           <w:p>
             <w:pPr>
-              <w:spacing w:before="0" w:after="0" w:line="312" w:lineRule="auto"/>
+              <w:spacing w:before="0" w:after="0" w:line="288" w:lineRule="auto"/>
               <w:jc w:val="right"/>
             </w:pPr>
             <w:r>
@@ -155,8 +157,8 @@
                 <w:b/>
                 <w:i w:val="0"/>
                 <w:color w:val="C2A78B"/>
-                <w:sz w:val="17"/>
-                <w:spacing w:val="14"/>
+                <w:sz w:val="16"/>
+                <w:spacing w:val="12"/>
               </w:rPr>
               <w:t xml:space="preserve">FECHA DE EMISIÓN  </w:t>
             </w:r>
@@ -166,7 +168,7 @@
                 <w:b w:val="0"/>
                 <w:i w:val="0"/>
                 <w:color w:val="FDFCFA"/>
-                <w:sz w:val="21"/>
+                <w:sz w:val="20"/>
               </w:rPr>
               <w:t>{{FECHA_EMISION}}</w:t>
             </w:r>
@@ -193,16 +195,17 @@
               <w:left w:val="nil"/>
               <w:right w:val="nil"/>
             </w:tcBorders>
+            <w:shd w:val="clear" w:color="auto" w:fill="F5EFE3"/>
             <w:tcMar>
-              <w:top w:w="520" w:type="dxa"/>
-              <w:bottom w:w="400" w:type="dxa"/>
-              <w:left w:w="600" w:type="dxa"/>
-              <w:right w:w="600" w:type="dxa"/>
+              <w:top w:w="320" w:type="dxa"/>
+              <w:bottom w:w="260" w:type="dxa"/>
+              <w:left w:w="560" w:type="dxa"/>
+              <w:right w:w="560" w:type="dxa"/>
             </w:tcMar>
           </w:tcPr>
           <w:p>
             <w:pPr>
-              <w:spacing w:after="60"/>
+              <w:spacing w:after="40"/>
               <w:jc w:val="center"/>
             </w:pPr>
             <w:r>
@@ -211,14 +214,14 @@
                 <w:b/>
                 <w:i w:val="0"/>
                 <w:color w:val="173D30"/>
-                <w:sz w:val="42"/>
+                <w:sz w:val="36"/>
               </w:rPr>
               <w:t>FACTURA DE HONORARIOS</w:t>
             </w:r>
           </w:p>
           <w:p>
             <w:pPr>
-              <w:spacing w:before="0" w:after="200" w:line="312" w:lineRule="auto"/>
+              <w:spacing w:before="0" w:after="120" w:line="288" w:lineRule="auto"/>
               <w:jc w:val="center"/>
             </w:pPr>
             <w:r>
@@ -227,18 +230,28 @@
                 <w:b w:val="0"/>
                 <w:i w:val="0"/>
                 <w:color w:val="6B6258"/>
-                <w:sz w:val="21"/>
+                <w:sz w:val="20"/>
               </w:rPr>
               <w:t>Ejercicio fiscal {{ANIO}} · Honorarios por tratamiento psicológico</w:t>
             </w:r>
           </w:p>
           <w:p>
             <w:pPr>
-              <w:spacing w:before="40" w:after="280" w:line="312" w:lineRule="auto"/>
+              <w:spacing w:before="0" w:after="200" w:line="288" w:lineRule="auto"/>
               <w:pBdr>
-                <w:bottom w:val="single" w:sz="6" w:space="1" w:color="C2A78B"/>
+                <w:bottom w:val="single" w:sz="6" w:space="2" w:color="C2A78B"/>
               </w:pBdr>
             </w:pPr>
+            <w:r>
+              <w:rPr>
+                <w:rFonts w:ascii="Century Gothic" w:hAnsi="Century Gothic"/>
+                <w:b w:val="0"/>
+                <w:i w:val="0"/>
+                <w:color w:val="2B2420"/>
+                <w:sz w:val="4"/>
+              </w:rPr>
+              <w:t xml:space="preserve"> </w:t>
+            </w:r>
           </w:p>
           <w:tbl>
             <w:tblPr>
@@ -260,16 +273,17 @@
                     <w:left w:val="single" w:sz="6" w:space="0" w:color="C2A78B"/>
                     <w:right w:val="single" w:sz="6" w:space="0" w:color="C2A78B"/>
                   </w:tcBorders>
+                  <w:shd w:val="clear" w:color="auto" w:fill="FDFCFA"/>
                   <w:tcMar>
-                    <w:top w:w="160" w:type="dxa"/>
-                    <w:bottom w:w="160" w:type="dxa"/>
-                    <w:left w:w="200" w:type="dxa"/>
-                    <w:right w:w="200" w:type="dxa"/>
+                    <w:top w:w="110" w:type="dxa"/>
+                    <w:bottom w:w="110" w:type="dxa"/>
+                    <w:left w:w="160" w:type="dxa"/>
+                    <w:right w:w="160" w:type="dxa"/>
                   </w:tcMar>
                 </w:tcPr>
                 <w:p>
                   <w:pPr>
-                    <w:spacing w:after="120"/>
+                    <w:spacing w:after="80"/>
                   </w:pPr>
                   <w:r>
                     <w:rPr>
@@ -278,15 +292,15 @@
                       <w:i w:val="0"/>
                       <w:caps/>
                       <w:color w:val="173D30"/>
-                      <w:sz w:val="17"/>
-                      <w:spacing w:val="22"/>
+                      <w:sz w:val="16"/>
+                      <w:spacing w:val="20"/>
                     </w:rPr>
                     <w:t>Emisor (profesional)</w:t>
                   </w:r>
                 </w:p>
                 <w:p>
                   <w:pPr>
-                    <w:spacing w:before="0" w:after="60" w:line="312" w:lineRule="auto"/>
+                    <w:spacing w:before="0" w:after="40" w:line="288" w:lineRule="auto"/>
                   </w:pPr>
                   <w:r>
                     <w:rPr>
@@ -294,14 +308,14 @@
                       <w:b/>
                       <w:i w:val="0"/>
                       <w:color w:val="173D30"/>
-                      <w:sz w:val="24"/>
+                      <w:sz w:val="23"/>
                     </w:rPr>
                     <w:t>Daniel Orozco Abia</w:t>
                   </w:r>
                 </w:p>
                 <w:p>
                   <w:pPr>
-                    <w:spacing w:before="0" w:after="20" w:line="324" w:lineRule="auto"/>
+                    <w:spacing w:before="0" w:after="0" w:line="312" w:lineRule="auto"/>
                   </w:pPr>
                   <w:r>
                     <w:rPr>
@@ -309,14 +323,14 @@
                       <w:b w:val="0"/>
                       <w:i w:val="0"/>
                       <w:color w:val="2B2420"/>
-                      <w:sz w:val="19"/>
+                      <w:sz w:val="18"/>
                     </w:rPr>
                     <w:t>NIF: 48442701D</w:t>
                   </w:r>
                 </w:p>
                 <w:p>
                   <w:pPr>
-                    <w:spacing w:before="0" w:after="20" w:line="324" w:lineRule="auto"/>
+                    <w:spacing w:before="0" w:after="0" w:line="312" w:lineRule="auto"/>
                   </w:pPr>
                   <w:r>
                     <w:rPr>
@@ -324,14 +338,14 @@
                       <w:b w:val="0"/>
                       <w:i w:val="0"/>
                       <w:color w:val="2B2420"/>
-                      <w:sz w:val="19"/>
+                      <w:sz w:val="18"/>
                     </w:rPr>
                     <w:t>Psicólogo General Sanitario · Col. CV11515</w:t>
                   </w:r>
                 </w:p>
                 <w:p>
                   <w:pPr>
-                    <w:spacing w:before="0" w:after="20" w:line="324" w:lineRule="auto"/>
+                    <w:spacing w:before="0" w:after="0" w:line="312" w:lineRule="auto"/>
                   </w:pPr>
                   <w:r>
                     <w:rPr>
@@ -339,14 +353,14 @@
                       <w:b w:val="0"/>
                       <w:i w:val="0"/>
                       <w:color w:val="2B2420"/>
-                      <w:sz w:val="19"/>
+                      <w:sz w:val="18"/>
                     </w:rPr>
-                    <w:t>Calle Embajador Vich 3, 1B</w:t>
+                    <w:t>Calle Embajador Vich 3, 1B · 46002 Valencia · España</w:t>
                   </w:r>
                 </w:p>
                 <w:p>
                   <w:pPr>
-                    <w:spacing w:before="0" w:after="20" w:line="324" w:lineRule="auto"/>
+                    <w:spacing w:before="0" w:after="0" w:line="312" w:lineRule="auto"/>
                   </w:pPr>
                   <w:r>
                     <w:rPr>
@@ -354,39 +368,9 @@
                       <w:b w:val="0"/>
                       <w:i w:val="0"/>
                       <w:color w:val="2B2420"/>
-                      <w:sz w:val="19"/>
+                      <w:sz w:val="18"/>
                     </w:rPr>
-                    <w:t>46002 Valencia · España</w:t>
-                  </w:r>
-                </w:p>
-                <w:p>
-                  <w:pPr>
-                    <w:spacing w:before="0" w:after="20" w:line="324" w:lineRule="auto"/>
-                  </w:pPr>
-                  <w:r>
-                    <w:rPr>
-                      <w:rFonts w:ascii="Century Gothic" w:hAnsi="Century Gothic"/>
-                      <w:b w:val="0"/>
-                      <w:i w:val="0"/>
-                      <w:color w:val="2B2420"/>
-                      <w:sz w:val="19"/>
-                    </w:rPr>
-                    <w:t>Tel.: 625 231 297</w:t>
-                  </w:r>
-                </w:p>
-                <w:p>
-                  <w:pPr>
-                    <w:spacing w:before="0" w:after="20" w:line="324" w:lineRule="auto"/>
-                  </w:pPr>
-                  <w:r>
-                    <w:rPr>
-                      <w:rFonts w:ascii="Century Gothic" w:hAnsi="Century Gothic"/>
-                      <w:b w:val="0"/>
-                      <w:i w:val="0"/>
-                      <w:color w:val="2B2420"/>
-                      <w:sz w:val="19"/>
-                    </w:rPr>
-                    <w:t>equipo@theworldismindproject.com</w:t>
+                    <w:t>Tel.: 625 231 297 · danielorozco@twimproject.com</w:t>
                   </w:r>
                 </w:p>
               </w:tc>
@@ -399,16 +383,17 @@
                     <w:left w:val="single" w:sz="6" w:space="0" w:color="C2A78B"/>
                     <w:right w:val="single" w:sz="6" w:space="0" w:color="C2A78B"/>
                   </w:tcBorders>
+                  <w:shd w:val="clear" w:color="auto" w:fill="FDFCFA"/>
                   <w:tcMar>
-                    <w:top w:w="160" w:type="dxa"/>
-                    <w:bottom w:w="160" w:type="dxa"/>
-                    <w:left w:w="200" w:type="dxa"/>
-                    <w:right w:w="200" w:type="dxa"/>
+                    <w:top w:w="110" w:type="dxa"/>
+                    <w:bottom w:w="110" w:type="dxa"/>
+                    <w:left w:w="160" w:type="dxa"/>
+                    <w:right w:w="160" w:type="dxa"/>
                   </w:tcMar>
                 </w:tcPr>
                 <w:p>
                   <w:pPr>
-                    <w:spacing w:after="120"/>
+                    <w:spacing w:after="80"/>
                   </w:pPr>
                   <w:r>
                     <w:rPr>
@@ -417,15 +402,15 @@
                       <w:i w:val="0"/>
                       <w:caps/>
                       <w:color w:val="173D30"/>
-                      <w:sz w:val="17"/>
-                      <w:spacing w:val="22"/>
+                      <w:sz w:val="16"/>
+                      <w:spacing w:val="20"/>
                     </w:rPr>
                     <w:t>Receptor (paciente)</w:t>
                   </w:r>
                 </w:p>
                 <w:p>
                   <w:pPr>
-                    <w:spacing w:before="0" w:after="60" w:line="312" w:lineRule="auto"/>
+                    <w:spacing w:before="0" w:after="40" w:line="288" w:lineRule="auto"/>
                   </w:pPr>
                   <w:r>
                     <w:rPr>
@@ -433,14 +418,14 @@
                       <w:b/>
                       <w:i w:val="0"/>
                       <w:color w:val="173D30"/>
-                      <w:sz w:val="24"/>
+                      <w:sz w:val="23"/>
                     </w:rPr>
                     <w:t>{{NOMBRE_PACIENTE}}</w:t>
                   </w:r>
                 </w:p>
                 <w:p>
                   <w:pPr>
-                    <w:spacing w:before="0" w:after="20" w:line="324" w:lineRule="auto"/>
+                    <w:spacing w:before="0" w:after="0" w:line="312" w:lineRule="auto"/>
                   </w:pPr>
                   <w:r>
                     <w:rPr>
@@ -448,14 +433,14 @@
                       <w:b w:val="0"/>
                       <w:i w:val="0"/>
                       <w:color w:val="2B2420"/>
-                      <w:sz w:val="19"/>
+                      <w:sz w:val="18"/>
                     </w:rPr>
                     <w:t>DNI: {{DNI_PACIENTE}}</w:t>
                   </w:r>
                 </w:p>
                 <w:p>
                   <w:pPr>
-                    <w:spacing w:before="0" w:after="20" w:line="324" w:lineRule="auto"/>
+                    <w:spacing w:before="0" w:after="0" w:line="312" w:lineRule="auto"/>
                   </w:pPr>
                   <w:r>
                     <w:rPr>
@@ -463,14 +448,14 @@
                       <w:b w:val="0"/>
                       <w:i w:val="0"/>
                       <w:color w:val="2B2420"/>
-                      <w:sz w:val="19"/>
+                      <w:sz w:val="18"/>
                     </w:rPr>
                     <w:t>{{DIRECCION_PACIENTE_LINEA1}}</w:t>
                   </w:r>
                 </w:p>
                 <w:p>
                   <w:pPr>
-                    <w:spacing w:before="0" w:after="20" w:line="324" w:lineRule="auto"/>
+                    <w:spacing w:before="0" w:after="0" w:line="312" w:lineRule="auto"/>
                   </w:pPr>
                   <w:r>
                     <w:rPr>
@@ -478,7 +463,7 @@
                       <w:b w:val="0"/>
                       <w:i w:val="0"/>
                       <w:color w:val="2B2420"/>
-                      <w:sz w:val="19"/>
+                      <w:sz w:val="18"/>
                     </w:rPr>
                     <w:t>{{DIRECCION_PACIENTE_LINEA2}}</w:t>
                   </w:r>
@@ -489,7 +474,7 @@
           <w:p/>
           <w:p>
             <w:pPr>
-              <w:spacing w:before="0" w:after="120" w:line="312" w:lineRule="auto"/>
+              <w:spacing w:before="0" w:after="80" w:line="288" w:lineRule="auto"/>
             </w:pPr>
           </w:p>
           <w:tbl>
@@ -516,10 +501,10 @@
                     <w:right w:val="single" w:sz="4" w:space="0" w:color="173D30"/>
                   </w:tcBorders>
                   <w:tcMar>
-                    <w:top w:w="120" w:type="dxa"/>
-                    <w:bottom w:w="120" w:type="dxa"/>
-                    <w:left w:w="140" w:type="dxa"/>
-                    <w:right w:w="140" w:type="dxa"/>
+                    <w:top w:w="90" w:type="dxa"/>
+                    <w:bottom w:w="90" w:type="dxa"/>
+                    <w:left w:w="130" w:type="dxa"/>
+                    <w:right w:w="130" w:type="dxa"/>
                   </w:tcMar>
                 </w:tcPr>
                 <w:p>
@@ -530,8 +515,8 @@
                       <w:i w:val="0"/>
                       <w:caps/>
                       <w:color w:val="FDFCFA"/>
-                      <w:sz w:val="17"/>
-                      <w:spacing w:val="14"/>
+                      <w:sz w:val="16"/>
+                      <w:spacing w:val="12"/>
                     </w:rPr>
                     <w:t>Descripción del servicio</w:t>
                   </w:r>
@@ -548,10 +533,10 @@
                     <w:right w:val="single" w:sz="4" w:space="0" w:color="173D30"/>
                   </w:tcBorders>
                   <w:tcMar>
-                    <w:top w:w="120" w:type="dxa"/>
-                    <w:bottom w:w="120" w:type="dxa"/>
-                    <w:left w:w="140" w:type="dxa"/>
-                    <w:right w:w="140" w:type="dxa"/>
+                    <w:top w:w="90" w:type="dxa"/>
+                    <w:bottom w:w="90" w:type="dxa"/>
+                    <w:left w:w="130" w:type="dxa"/>
+                    <w:right w:w="130" w:type="dxa"/>
                   </w:tcMar>
                 </w:tcPr>
                 <w:p>
@@ -562,8 +547,8 @@
                       <w:i w:val="0"/>
                       <w:caps/>
                       <w:color w:val="FDFCFA"/>
-                      <w:sz w:val="17"/>
-                      <w:spacing w:val="14"/>
+                      <w:sz w:val="16"/>
+                      <w:spacing w:val="12"/>
                     </w:rPr>
                     <w:t>Período</w:t>
                   </w:r>
@@ -580,10 +565,10 @@
                     <w:right w:val="single" w:sz="4" w:space="0" w:color="173D30"/>
                   </w:tcBorders>
                   <w:tcMar>
-                    <w:top w:w="120" w:type="dxa"/>
-                    <w:bottom w:w="120" w:type="dxa"/>
-                    <w:left w:w="140" w:type="dxa"/>
-                    <w:right w:w="140" w:type="dxa"/>
+                    <w:top w:w="90" w:type="dxa"/>
+                    <w:bottom w:w="90" w:type="dxa"/>
+                    <w:left w:w="130" w:type="dxa"/>
+                    <w:right w:w="130" w:type="dxa"/>
                   </w:tcMar>
                 </w:tcPr>
                 <w:p>
@@ -594,8 +579,8 @@
                       <w:i w:val="0"/>
                       <w:caps/>
                       <w:color w:val="FDFCFA"/>
-                      <w:sz w:val="17"/>
-                      <w:spacing w:val="14"/>
+                      <w:sz w:val="16"/>
+                      <w:spacing w:val="12"/>
                     </w:rPr>
                     <w:t>Sesiones</w:t>
                   </w:r>
@@ -612,10 +597,10 @@
                     <w:right w:val="single" w:sz="4" w:space="0" w:color="173D30"/>
                   </w:tcBorders>
                   <w:tcMar>
-                    <w:top w:w="120" w:type="dxa"/>
-                    <w:bottom w:w="120" w:type="dxa"/>
-                    <w:left w:w="140" w:type="dxa"/>
-                    <w:right w:w="140" w:type="dxa"/>
+                    <w:top w:w="90" w:type="dxa"/>
+                    <w:bottom w:w="90" w:type="dxa"/>
+                    <w:left w:w="130" w:type="dxa"/>
+                    <w:right w:w="130" w:type="dxa"/>
                   </w:tcMar>
                 </w:tcPr>
                 <w:p>
@@ -629,8 +614,8 @@
                       <w:i w:val="0"/>
                       <w:caps/>
                       <w:color w:val="FDFCFA"/>
-                      <w:sz w:val="17"/>
-                      <w:spacing w:val="14"/>
+                      <w:sz w:val="16"/>
+                      <w:spacing w:val="12"/>
                     </w:rPr>
                     <w:t>Importe</w:t>
                   </w:r>
@@ -647,11 +632,12 @@
                     <w:left w:val="single" w:sz="4" w:space="0" w:color="E3DAC9"/>
                     <w:right w:val="single" w:sz="4" w:space="0" w:color="E3DAC9"/>
                   </w:tcBorders>
+                  <w:shd w:val="clear" w:color="auto" w:fill="FDFCFA"/>
                   <w:tcMar>
-                    <w:top w:w="150" w:type="dxa"/>
-                    <w:bottom w:w="150" w:type="dxa"/>
-                    <w:left w:w="140" w:type="dxa"/>
-                    <w:right w:w="140" w:type="dxa"/>
+                    <w:top w:w="110" w:type="dxa"/>
+                    <w:bottom w:w="110" w:type="dxa"/>
+                    <w:left w:w="130" w:type="dxa"/>
+                    <w:right w:w="130" w:type="dxa"/>
                   </w:tcMar>
                 </w:tcPr>
                 <w:p>
@@ -661,7 +647,7 @@
                       <w:b w:val="0"/>
                       <w:i w:val="0"/>
                       <w:color w:val="2B2420"/>
-                      <w:sz w:val="21"/>
+                      <w:sz w:val="20"/>
                     </w:rPr>
                     <w:t>Honorarios por tratamiento psicológico</w:t>
                   </w:r>
@@ -676,11 +662,12 @@
                     <w:left w:val="single" w:sz="4" w:space="0" w:color="E3DAC9"/>
                     <w:right w:val="single" w:sz="4" w:space="0" w:color="E3DAC9"/>
                   </w:tcBorders>
+                  <w:shd w:val="clear" w:color="auto" w:fill="FDFCFA"/>
                   <w:tcMar>
-                    <w:top w:w="150" w:type="dxa"/>
-                    <w:bottom w:w="150" w:type="dxa"/>
-                    <w:left w:w="140" w:type="dxa"/>
-                    <w:right w:w="140" w:type="dxa"/>
+                    <w:top w:w="110" w:type="dxa"/>
+                    <w:bottom w:w="110" w:type="dxa"/>
+                    <w:left w:w="130" w:type="dxa"/>
+                    <w:right w:w="130" w:type="dxa"/>
                   </w:tcMar>
                 </w:tcPr>
                 <w:p>
@@ -690,7 +677,7 @@
                       <w:b w:val="0"/>
                       <w:i w:val="0"/>
                       <w:color w:val="2B2420"/>
-                      <w:sz w:val="21"/>
+                      <w:sz w:val="20"/>
                     </w:rPr>
                     <w:t>{{PERIODO}}</w:t>
                   </w:r>
@@ -705,11 +692,12 @@
                     <w:left w:val="single" w:sz="4" w:space="0" w:color="E3DAC9"/>
                     <w:right w:val="single" w:sz="4" w:space="0" w:color="E3DAC9"/>
                   </w:tcBorders>
+                  <w:shd w:val="clear" w:color="auto" w:fill="FDFCFA"/>
                   <w:tcMar>
-                    <w:top w:w="150" w:type="dxa"/>
-                    <w:bottom w:w="150" w:type="dxa"/>
-                    <w:left w:w="140" w:type="dxa"/>
-                    <w:right w:w="140" w:type="dxa"/>
+                    <w:top w:w="110" w:type="dxa"/>
+                    <w:bottom w:w="110" w:type="dxa"/>
+                    <w:left w:w="130" w:type="dxa"/>
+                    <w:right w:w="130" w:type="dxa"/>
                   </w:tcMar>
                 </w:tcPr>
                 <w:p>
@@ -719,7 +707,7 @@
                       <w:b w:val="0"/>
                       <w:i w:val="0"/>
                       <w:color w:val="2B2420"/>
-                      <w:sz w:val="21"/>
+                      <w:sz w:val="20"/>
                     </w:rPr>
                     <w:t>{{NUM_SESIONES}}</w:t>
                   </w:r>
@@ -734,11 +722,12 @@
                     <w:left w:val="single" w:sz="4" w:space="0" w:color="E3DAC9"/>
                     <w:right w:val="single" w:sz="4" w:space="0" w:color="E3DAC9"/>
                   </w:tcBorders>
+                  <w:shd w:val="clear" w:color="auto" w:fill="FDFCFA"/>
                   <w:tcMar>
-                    <w:top w:w="150" w:type="dxa"/>
-                    <w:bottom w:w="150" w:type="dxa"/>
-                    <w:left w:w="140" w:type="dxa"/>
-                    <w:right w:w="140" w:type="dxa"/>
+                    <w:top w:w="110" w:type="dxa"/>
+                    <w:bottom w:w="110" w:type="dxa"/>
+                    <w:left w:w="130" w:type="dxa"/>
+                    <w:right w:w="130" w:type="dxa"/>
                   </w:tcMar>
                 </w:tcPr>
                 <w:p>
@@ -751,7 +740,7 @@
                       <w:b/>
                       <w:i w:val="0"/>
                       <w:color w:val="2B2420"/>
-                      <w:sz w:val="21"/>
+                      <w:sz w:val="20"/>
                     </w:rPr>
                     <w:t>{{IMPORTE}}</w:t>
                   </w:r>
@@ -762,7 +751,7 @@
           <w:p/>
           <w:p>
             <w:pPr>
-              <w:spacing w:before="160" w:after="280" w:line="312" w:lineRule="auto"/>
+              <w:spacing w:before="120" w:after="200" w:line="288" w:lineRule="auto"/>
             </w:pPr>
             <w:r>
               <w:rPr>
@@ -770,7 +759,7 @@
                 <w:b w:val="0"/>
                 <w:i/>
                 <w:color w:val="6B6258"/>
-                <w:sz w:val="17"/>
+                <w:sz w:val="16"/>
               </w:rPr>
               <w:t>* Servicio exento de IVA según art. 20.1.3º Ley 37/1992 (servicios de asistencia sanitaria).</w:t>
             </w:r>
@@ -797,10 +786,10 @@
                     <w:right w:val="nil"/>
                   </w:tcBorders>
                   <w:tcMar>
-                    <w:top w:w="170" w:type="dxa"/>
-                    <w:bottom w:w="170" w:type="dxa"/>
-                    <w:left w:w="240" w:type="dxa"/>
-                    <w:right w:w="240" w:type="dxa"/>
+                    <w:top w:w="120" w:type="dxa"/>
+                    <w:bottom w:w="120" w:type="dxa"/>
+                    <w:left w:w="220" w:type="dxa"/>
+                    <w:right w:w="220" w:type="dxa"/>
                   </w:tcMar>
                   <w:vAlign w:val="center"/>
                 </w:tcPr>
@@ -812,8 +801,8 @@
                       <w:i w:val="0"/>
                       <w:caps/>
                       <w:color w:val="FDFCFA"/>
-                      <w:sz w:val="22"/>
-                      <w:spacing w:val="14"/>
+                      <w:sz w:val="21"/>
+                      <w:spacing w:val="12"/>
                     </w:rPr>
                     <w:t>Total a abonar</w:t>
                   </w:r>
@@ -830,10 +819,10 @@
                     <w:right w:val="nil"/>
                   </w:tcBorders>
                   <w:tcMar>
-                    <w:top w:w="170" w:type="dxa"/>
-                    <w:bottom w:w="170" w:type="dxa"/>
-                    <w:left w:w="240" w:type="dxa"/>
-                    <w:right w:w="240" w:type="dxa"/>
+                    <w:top w:w="120" w:type="dxa"/>
+                    <w:bottom w:w="120" w:type="dxa"/>
+                    <w:left w:w="220" w:type="dxa"/>
+                    <w:right w:w="220" w:type="dxa"/>
                   </w:tcMar>
                   <w:vAlign w:val="center"/>
                 </w:tcPr>
@@ -847,7 +836,7 @@
                       <w:b/>
                       <w:i w:val="0"/>
                       <w:color w:val="FDFCFA"/>
-                      <w:sz w:val="36"/>
+                      <w:sz w:val="32"/>
                     </w:rPr>
                     <w:t>{{IMPORTE}}</w:t>
                   </w:r>
@@ -858,12 +847,12 @@
           <w:p/>
           <w:p>
             <w:pPr>
-              <w:spacing w:before="0" w:after="200" w:line="312" w:lineRule="auto"/>
+              <w:spacing w:before="0" w:after="120" w:line="288" w:lineRule="auto"/>
             </w:pPr>
           </w:p>
           <w:p>
             <w:pPr>
-              <w:spacing w:before="0" w:after="40" w:line="360" w:lineRule="auto"/>
+              <w:spacing w:before="0" w:after="20" w:line="336" w:lineRule="auto"/>
             </w:pPr>
             <w:r>
               <w:rPr>
@@ -871,14 +860,14 @@
                 <w:b w:val="0"/>
                 <w:i w:val="0"/>
                 <w:color w:val="2B2420"/>
-                <w:sz w:val="20"/>
+                <w:sz w:val="19"/>
               </w:rPr>
               <w:t>El presente documento acredita los honorarios satisfechos en concepto de tratamiento psicológico durante el ejercicio fiscal {{ANIO}}, a efectos de declaración del IRPF.</w:t>
             </w:r>
           </w:p>
           <w:p>
             <w:pPr>
-              <w:spacing w:before="0" w:after="40" w:line="360" w:lineRule="auto"/>
+              <w:spacing w:before="0" w:after="20" w:line="336" w:lineRule="auto"/>
             </w:pPr>
             <w:r>
               <w:rPr>
@@ -886,21 +875,21 @@
                 <w:b w:val="0"/>
                 <w:i w:val="0"/>
                 <w:color w:val="2B2420"/>
-                <w:sz w:val="20"/>
+                <w:sz w:val="19"/>
               </w:rPr>
               <w:t>Emitido en Valencia, a {{FECHA_EMISION}}.</w:t>
             </w:r>
           </w:p>
           <w:p>
             <w:pPr>
-              <w:spacing w:before="0" w:after="480" w:line="312" w:lineRule="auto"/>
+              <w:spacing w:before="0" w:after="280" w:line="288" w:lineRule="auto"/>
             </w:pPr>
           </w:p>
           <w:p>
             <w:pPr>
-              <w:spacing w:before="0" w:after="80" w:line="312" w:lineRule="auto"/>
+              <w:spacing w:before="0" w:after="60" w:line="288" w:lineRule="auto"/>
               <w:pBdr>
-                <w:bottom w:val="single" w:sz="6" w:space="1" w:color="2B2420"/>
+                <w:bottom w:val="single" w:sz="6" w:space="2" w:color="2B2420"/>
               </w:pBdr>
             </w:pPr>
             <w:r>
@@ -909,14 +898,14 @@
                 <w:b w:val="0"/>
                 <w:i w:val="0"/>
                 <w:color w:val="2B2420"/>
-                <w:sz w:val="20"/>
+                <w:sz w:val="4"/>
               </w:rPr>
               <w:t xml:space="preserve"> </w:t>
             </w:r>
           </w:p>
           <w:p>
             <w:pPr>
-              <w:spacing w:before="0" w:after="20" w:line="312" w:lineRule="auto"/>
+              <w:spacing w:before="0" w:after="0" w:line="288" w:lineRule="auto"/>
             </w:pPr>
             <w:r>
               <w:rPr>
@@ -924,14 +913,14 @@
                 <w:b/>
                 <w:i w:val="0"/>
                 <w:color w:val="173D30"/>
-                <w:sz w:val="22"/>
+                <w:sz w:val="21"/>
               </w:rPr>
               <w:t>Daniel Orozco Abia</w:t>
             </w:r>
           </w:p>
           <w:p>
             <w:pPr>
-              <w:spacing w:before="0" w:after="0" w:line="312" w:lineRule="auto"/>
+              <w:spacing w:before="0" w:after="0" w:line="288" w:lineRule="auto"/>
             </w:pPr>
             <w:r>
               <w:rPr>
@@ -939,14 +928,14 @@
                 <w:b w:val="0"/>
                 <w:i w:val="0"/>
                 <w:color w:val="6B6258"/>
-                <w:sz w:val="19"/>
+                <w:sz w:val="18"/>
               </w:rPr>
               <w:t>Psicólogo General Sanitario · Col. CV11515</w:t>
             </w:r>
           </w:p>
           <w:p>
             <w:pPr>
-              <w:spacing w:before="440" w:after="0" w:line="312" w:lineRule="auto"/>
+              <w:spacing w:before="280" w:after="0" w:line="288" w:lineRule="auto"/>
               <w:jc w:val="center"/>
               <w:pBdr>
                 <w:top w:val="single" w:sz="6" w:space="6" w:color="C2A78B"/>
@@ -958,9 +947,9 @@
                 <w:b w:val="0"/>
                 <w:i w:val="0"/>
                 <w:color w:val="6B6258"/>
-                <w:sz w:val="18"/>
+                <w:sz w:val="17"/>
               </w:rPr>
-              <w:t>Calle Embajador Vich 3, 1B  ·  46002 Valencia  ·  Tel. 625 231 297  ·  equipo@theworldismindproject.com</w:t>
+              <w:t>Calle Embajador Vich 3, 1B  ·  46002 Valencia  ·  Tel. 625 231 297  ·  danielorozco@twimproject.com</w:t>
             </w:r>
           </w:p>
         </w:tc>

</xml_diff>

<commit_message>
Plantillas factura .docx v3: fondo crema suave #FDFCFA (el de la web)
Daniel · el crema #F5EFE3 era demasiado intenso. Cambiado al crema
oficial TWIM #FDFCFA (casi blanco, calidez mínima · «como en la web»).
Tarjetas parties y filas de datos pasan a blanco puro #FFFFFF para
mantener un contraste sutil sobre el fondo crema-suave.
</commit_message>
<xml_diff>
--- a/documentos-internos/plantillas/factura-anual-renta.docx
+++ b/documentos-internos/plantillas/factura-anual-renta.docx
@@ -1,7 +1,7 @@
 
 <file path=word/document.xml><?xml version="1.0" encoding="utf-8"?>
 <w:document xmlns:wpc="http://schemas.microsoft.com/office/word/2010/wordprocessingCanvas" xmlns:mo="http://schemas.microsoft.com/office/mac/office/2008/main" xmlns:mc="http://schemas.openxmlformats.org/markup-compatibility/2006" xmlns:mv="urn:schemas-microsoft-com:mac:vml" xmlns:o="urn:schemas-microsoft-com:office:office" xmlns:r="http://schemas.openxmlformats.org/officeDocument/2006/relationships" xmlns:m="http://schemas.openxmlformats.org/officeDocument/2006/math" xmlns:v="urn:schemas-microsoft-com:vml" xmlns:wp14="http://schemas.microsoft.com/office/word/2010/wordprocessingDrawing" xmlns:wp="http://schemas.openxmlformats.org/drawingml/2006/wordprocessingDrawing" xmlns:w10="urn:schemas-microsoft-com:office:word" xmlns:w="http://schemas.openxmlformats.org/wordprocessingml/2006/main" xmlns:w14="http://schemas.microsoft.com/office/word/2010/wordml" xmlns:wpg="http://schemas.microsoft.com/office/word/2010/wordprocessingGroup" xmlns:wpi="http://schemas.microsoft.com/office/word/2010/wordprocessingInk" xmlns:wne="http://schemas.microsoft.com/office/word/2006/wordml" xmlns:wps="http://schemas.microsoft.com/office/word/2010/wordprocessingShape" mc:Ignorable="w14 wp14">
-  <w:background w:color="F5EFE3"/>
+  <w:background w:color="FDFCFA"/>
   <w:body>
     <w:tbl>
       <w:tblPr>
@@ -94,7 +94,7 @@
                 <w:rFonts w:ascii="Century Gothic" w:hAnsi="Century Gothic"/>
                 <w:b w:val="0"/>
                 <w:i w:val="0"/>
-                <w:color w:val="FDFCFA"/>
+                <w:color w:val="FFFFFF"/>
                 <w:sz w:val="19"/>
               </w:rPr>
               <w:t>Daniel Orozco Abia · CV11515</w:t>
@@ -140,7 +140,7 @@
                 <w:rFonts w:ascii="Century Gothic" w:hAnsi="Century Gothic"/>
                 <w:b w:val="0"/>
                 <w:i w:val="0"/>
-                <w:color w:val="FDFCFA"/>
+                <w:color w:val="FFFFFF"/>
                 <w:sz w:val="20"/>
               </w:rPr>
               <w:t>{{NUMERO_FACTURA}}</w:t>
@@ -167,7 +167,7 @@
                 <w:rFonts w:ascii="Century Gothic" w:hAnsi="Century Gothic"/>
                 <w:b w:val="0"/>
                 <w:i w:val="0"/>
-                <w:color w:val="FDFCFA"/>
+                <w:color w:val="FFFFFF"/>
                 <w:sz w:val="20"/>
               </w:rPr>
               <w:t>{{FECHA_EMISION}}</w:t>
@@ -195,7 +195,7 @@
               <w:left w:val="nil"/>
               <w:right w:val="nil"/>
             </w:tcBorders>
-            <w:shd w:val="clear" w:color="auto" w:fill="F5EFE3"/>
+            <w:shd w:val="clear" w:color="auto" w:fill="FDFCFA"/>
             <w:tcMar>
               <w:top w:w="320" w:type="dxa"/>
               <w:bottom w:w="260" w:type="dxa"/>
@@ -273,7 +273,7 @@
                     <w:left w:val="single" w:sz="6" w:space="0" w:color="C2A78B"/>
                     <w:right w:val="single" w:sz="6" w:space="0" w:color="C2A78B"/>
                   </w:tcBorders>
-                  <w:shd w:val="clear" w:color="auto" w:fill="FDFCFA"/>
+                  <w:shd w:val="clear" w:color="auto" w:fill="FFFFFF"/>
                   <w:tcMar>
                     <w:top w:w="110" w:type="dxa"/>
                     <w:bottom w:w="110" w:type="dxa"/>
@@ -383,7 +383,7 @@
                     <w:left w:val="single" w:sz="6" w:space="0" w:color="C2A78B"/>
                     <w:right w:val="single" w:sz="6" w:space="0" w:color="C2A78B"/>
                   </w:tcBorders>
-                  <w:shd w:val="clear" w:color="auto" w:fill="FDFCFA"/>
+                  <w:shd w:val="clear" w:color="auto" w:fill="FFFFFF"/>
                   <w:tcMar>
                     <w:top w:w="110" w:type="dxa"/>
                     <w:bottom w:w="110" w:type="dxa"/>
@@ -514,7 +514,7 @@
                       <w:b/>
                       <w:i w:val="0"/>
                       <w:caps/>
-                      <w:color w:val="FDFCFA"/>
+                      <w:color w:val="FFFFFF"/>
                       <w:sz w:val="16"/>
                       <w:spacing w:val="12"/>
                     </w:rPr>
@@ -546,7 +546,7 @@
                       <w:b/>
                       <w:i w:val="0"/>
                       <w:caps/>
-                      <w:color w:val="FDFCFA"/>
+                      <w:color w:val="FFFFFF"/>
                       <w:sz w:val="16"/>
                       <w:spacing w:val="12"/>
                     </w:rPr>
@@ -578,7 +578,7 @@
                       <w:b/>
                       <w:i w:val="0"/>
                       <w:caps/>
-                      <w:color w:val="FDFCFA"/>
+                      <w:color w:val="FFFFFF"/>
                       <w:sz w:val="16"/>
                       <w:spacing w:val="12"/>
                     </w:rPr>
@@ -613,7 +613,7 @@
                       <w:b/>
                       <w:i w:val="0"/>
                       <w:caps/>
-                      <w:color w:val="FDFCFA"/>
+                      <w:color w:val="FFFFFF"/>
                       <w:sz w:val="16"/>
                       <w:spacing w:val="12"/>
                     </w:rPr>
@@ -632,7 +632,7 @@
                     <w:left w:val="single" w:sz="4" w:space="0" w:color="E3DAC9"/>
                     <w:right w:val="single" w:sz="4" w:space="0" w:color="E3DAC9"/>
                   </w:tcBorders>
-                  <w:shd w:val="clear" w:color="auto" w:fill="FDFCFA"/>
+                  <w:shd w:val="clear" w:color="auto" w:fill="FFFFFF"/>
                   <w:tcMar>
                     <w:top w:w="110" w:type="dxa"/>
                     <w:bottom w:w="110" w:type="dxa"/>
@@ -662,7 +662,7 @@
                     <w:left w:val="single" w:sz="4" w:space="0" w:color="E3DAC9"/>
                     <w:right w:val="single" w:sz="4" w:space="0" w:color="E3DAC9"/>
                   </w:tcBorders>
-                  <w:shd w:val="clear" w:color="auto" w:fill="FDFCFA"/>
+                  <w:shd w:val="clear" w:color="auto" w:fill="FFFFFF"/>
                   <w:tcMar>
                     <w:top w:w="110" w:type="dxa"/>
                     <w:bottom w:w="110" w:type="dxa"/>
@@ -692,7 +692,7 @@
                     <w:left w:val="single" w:sz="4" w:space="0" w:color="E3DAC9"/>
                     <w:right w:val="single" w:sz="4" w:space="0" w:color="E3DAC9"/>
                   </w:tcBorders>
-                  <w:shd w:val="clear" w:color="auto" w:fill="FDFCFA"/>
+                  <w:shd w:val="clear" w:color="auto" w:fill="FFFFFF"/>
                   <w:tcMar>
                     <w:top w:w="110" w:type="dxa"/>
                     <w:bottom w:w="110" w:type="dxa"/>
@@ -722,7 +722,7 @@
                     <w:left w:val="single" w:sz="4" w:space="0" w:color="E3DAC9"/>
                     <w:right w:val="single" w:sz="4" w:space="0" w:color="E3DAC9"/>
                   </w:tcBorders>
-                  <w:shd w:val="clear" w:color="auto" w:fill="FDFCFA"/>
+                  <w:shd w:val="clear" w:color="auto" w:fill="FFFFFF"/>
                   <w:tcMar>
                     <w:top w:w="110" w:type="dxa"/>
                     <w:bottom w:w="110" w:type="dxa"/>
@@ -800,7 +800,7 @@
                       <w:b/>
                       <w:i w:val="0"/>
                       <w:caps/>
-                      <w:color w:val="FDFCFA"/>
+                      <w:color w:val="FFFFFF"/>
                       <w:sz w:val="21"/>
                       <w:spacing w:val="12"/>
                     </w:rPr>
@@ -835,7 +835,7 @@
                       <w:rFonts w:ascii="Century Gothic" w:hAnsi="Century Gothic"/>
                       <w:b/>
                       <w:i w:val="0"/>
-                      <w:color w:val="FDFCFA"/>
+                      <w:color w:val="FFFFFF"/>
                       <w:sz w:val="32"/>
                     </w:rPr>
                     <w:t>{{IMPORTE}}</w:t>

</xml_diff>